<commit_message>
Rename and combine documents into master document
</commit_message>
<xml_diff>
--- a/docs/Report/External API.docx
+++ b/docs/Report/External API.docx
@@ -4,29 +4,28 @@
   <w:body>
     <w:p>
       <w:pPr>
-        <w:ind w:left="0"/>
-      </w:pPr>
-    </w:p>
-    <w:p>
-      <w:pPr>
-        <w:pStyle w:val="Heading1"/>
-      </w:pPr>
-      <w:bookmarkStart w:id="0" w:name="_Toc217598120"/>
-      <w:bookmarkStart w:id="1" w:name="_Toc217532936"/>
-      <w:bookmarkStart w:id="2" w:name="_Toc228029786"/>
+        <w:pStyle w:val="Heading2"/>
+      </w:pPr>
+      <w:bookmarkStart w:id="0" w:name="_Toc228029786"/>
+      <w:bookmarkStart w:id="1" w:name="_Toc217598120"/>
+      <w:bookmarkStart w:id="2" w:name="_Toc217532936"/>
+      <w:bookmarkStart w:id="3" w:name="_Toc228053377"/>
       <w:r>
         <w:t>API for Interfacing External Stores</w:t>
       </w:r>
+      <w:bookmarkEnd w:id="3"/>
     </w:p>
     <w:p>
       <w:pPr>
         <w:pStyle w:val="Heading3"/>
         <w:ind w:firstLine="0"/>
       </w:pPr>
+      <w:bookmarkStart w:id="4" w:name="_Toc228053378"/>
       <w:r>
         <w:t>Overview</w:t>
       </w:r>
-      <w:bookmarkEnd w:id="2"/>
+      <w:bookmarkEnd w:id="0"/>
+      <w:bookmarkEnd w:id="4"/>
     </w:p>
     <w:p>
       <w:pPr>
@@ -45,11 +44,13 @@
           <w:bCs/>
         </w:rPr>
       </w:pPr>
-      <w:bookmarkStart w:id="3" w:name="_Toc228029787"/>
+      <w:bookmarkStart w:id="5" w:name="_Toc228029787"/>
+      <w:bookmarkStart w:id="6" w:name="_Toc228053379"/>
       <w:r>
         <w:t>Authentication</w:t>
       </w:r>
-      <w:bookmarkEnd w:id="3"/>
+      <w:bookmarkEnd w:id="5"/>
+      <w:bookmarkEnd w:id="6"/>
     </w:p>
     <w:p>
       <w:pPr>
@@ -83,11 +84,13 @@
         <w:pStyle w:val="Heading3"/>
         <w:ind w:firstLine="0"/>
       </w:pPr>
-      <w:bookmarkStart w:id="4" w:name="_Toc228029788"/>
+      <w:bookmarkStart w:id="7" w:name="_Toc228029788"/>
+      <w:bookmarkStart w:id="8" w:name="_Toc228053380"/>
       <w:r>
         <w:t>Endpoints</w:t>
       </w:r>
-      <w:bookmarkEnd w:id="4"/>
+      <w:bookmarkEnd w:id="7"/>
+      <w:bookmarkEnd w:id="8"/>
     </w:p>
     <w:p>
       <w:pPr>
@@ -330,6 +333,14 @@
         </w:rPr>
         <w:t>}</w:t>
       </w:r>
+    </w:p>
+    <w:p>
+      <w:pPr>
+        <w:rPr>
+          <w:b/>
+          <w:bCs/>
+        </w:rPr>
+      </w:pPr>
     </w:p>
     <w:p>
       <w:r>
@@ -560,7 +571,6 @@
               <w:ind w:left="0"/>
             </w:pPr>
             <w:r>
-              <w:lastRenderedPageBreak/>
               <w:t>customer_email</w:t>
             </w:r>
           </w:p>
@@ -631,11 +641,13 @@
           <w:bCs/>
         </w:rPr>
       </w:pPr>
-      <w:bookmarkStart w:id="5" w:name="_Toc228029789"/>
+      <w:bookmarkStart w:id="9" w:name="_Toc228029789"/>
+      <w:bookmarkStart w:id="10" w:name="_Toc228053381"/>
       <w:r>
         <w:t>What Happens When an Order is Placed</w:t>
       </w:r>
-      <w:bookmarkEnd w:id="5"/>
+      <w:bookmarkEnd w:id="9"/>
+      <w:bookmarkEnd w:id="10"/>
     </w:p>
     <w:p>
       <w:pPr>
@@ -716,15 +728,7 @@
         <w:ind w:left="0"/>
       </w:pPr>
       <w:r>
-        <w:t xml:space="preserve">If any of these steps fail, the entire operation is rolled </w:t>
-      </w:r>
-      <w:proofErr w:type="gramStart"/>
-      <w:r>
-        <w:t>back</w:t>
-      </w:r>
-      <w:proofErr w:type="gramEnd"/>
-      <w:r>
-        <w:t xml:space="preserve"> and no changes are made to the database.</w:t>
+        <w:t>If any of these steps fail, the entire operation is rolled back and no changes are made to the database.</w:t>
       </w:r>
     </w:p>
     <w:p>
@@ -736,11 +740,13 @@
           <w:bCs/>
         </w:rPr>
       </w:pPr>
-      <w:bookmarkStart w:id="6" w:name="_Toc228029790"/>
+      <w:bookmarkStart w:id="11" w:name="_Toc228029790"/>
+      <w:bookmarkStart w:id="12" w:name="_Toc228053382"/>
       <w:r>
         <w:t>Example Integration Flow</w:t>
       </w:r>
-      <w:bookmarkEnd w:id="6"/>
+      <w:bookmarkEnd w:id="11"/>
+      <w:bookmarkEnd w:id="12"/>
     </w:p>
     <w:p>
       <w:pPr>
@@ -814,83 +820,8 @@
         <w:ind w:left="0"/>
       </w:pPr>
     </w:p>
-    <w:p>
-      <w:pPr>
-        <w:ind w:left="0"/>
-      </w:pPr>
-    </w:p>
-    <w:p>
-      <w:pPr>
-        <w:ind w:left="0"/>
-      </w:pPr>
-    </w:p>
-    <w:p>
-      <w:pPr>
-        <w:ind w:left="0"/>
-      </w:pPr>
-    </w:p>
-    <w:p>
-      <w:pPr>
-        <w:ind w:left="0"/>
-      </w:pPr>
-    </w:p>
-    <w:p>
-      <w:pPr>
-        <w:ind w:left="0"/>
-      </w:pPr>
-    </w:p>
-    <w:p>
-      <w:pPr>
-        <w:ind w:left="0"/>
-      </w:pPr>
-    </w:p>
-    <w:p>
-      <w:pPr>
-        <w:ind w:left="0"/>
-      </w:pPr>
-    </w:p>
-    <w:p>
-      <w:pPr>
-        <w:ind w:left="0"/>
-      </w:pPr>
-    </w:p>
-    <w:p>
-      <w:pPr>
-        <w:ind w:left="0"/>
-      </w:pPr>
-    </w:p>
-    <w:p>
-      <w:pPr>
-        <w:ind w:left="0"/>
-      </w:pPr>
-    </w:p>
-    <w:p>
-      <w:pPr>
-        <w:ind w:left="0"/>
-      </w:pPr>
-    </w:p>
-    <w:p>
-      <w:pPr>
-        <w:ind w:left="0"/>
-      </w:pPr>
-    </w:p>
-    <w:p>
-      <w:pPr>
-        <w:ind w:left="0"/>
-      </w:pPr>
-    </w:p>
-    <w:p>
-      <w:pPr>
-        <w:ind w:left="0"/>
-      </w:pPr>
-    </w:p>
-    <w:p>
-      <w:pPr>
-        <w:ind w:left="0"/>
-      </w:pPr>
-    </w:p>
-    <w:bookmarkEnd w:id="0"/>
     <w:bookmarkEnd w:id="1"/>
+    <w:bookmarkEnd w:id="2"/>
     <w:p>
       <w:pPr>
         <w:ind w:left="0"/>

</xml_diff>